<commit_message>
Fix submodule error and upload full code
</commit_message>
<xml_diff>
--- a/Phieu_Cham_Do_An_LapTrinhDiDong.docx
+++ b/Phieu_Cham_Do_An_LapTrinhDiDong.docx
@@ -261,7 +261,25 @@
         <w:t>………………….Tạ Quốc Ý</w:t>
       </w:r>
       <w:r>
-        <w:t>............................    Ngày chấm: .......... / .......... / ..............</w:t>
+        <w:t>............................    Ngày chấm: ...</w:t>
+      </w:r>
+      <w:r>
+        <w:t>14</w:t>
+      </w:r>
+      <w:r>
+        <w:t>... / ....</w:t>
+      </w:r>
+      <w:r>
+        <w:t>5</w:t>
+      </w:r>
+      <w:r>
+        <w:t>.... / ...</w:t>
+      </w:r>
+      <w:r>
+        <w:t>2026</w:t>
+      </w:r>
+      <w:r>
+        <w:t>...</w:t>
       </w:r>
     </w:p>
     <w:p/>
@@ -635,6 +653,9 @@
             <w:pPr>
               <w:jc w:val="center"/>
             </w:pPr>
+            <w:r>
+              <w:t>38</w:t>
+            </w:r>
           </w:p>
         </w:tc>
         <w:tc>
@@ -801,6 +822,9 @@
             <w:pPr>
               <w:jc w:val="center"/>
             </w:pPr>
+            <w:r>
+              <w:t>8</w:t>
+            </w:r>
           </w:p>
         </w:tc>
         <w:tc>
@@ -967,6 +991,9 @@
             <w:pPr>
               <w:jc w:val="center"/>
             </w:pPr>
+            <w:r>
+              <w:t>8</w:t>
+            </w:r>
           </w:p>
         </w:tc>
         <w:tc>
@@ -1124,6 +1151,9 @@
             <w:pPr>
               <w:jc w:val="center"/>
             </w:pPr>
+            <w:r>
+              <w:t>4</w:t>
+            </w:r>
           </w:p>
         </w:tc>
         <w:tc>
@@ -1321,6 +1351,9 @@
             <w:pPr>
               <w:jc w:val="center"/>
             </w:pPr>
+            <w:r>
+              <w:t>10</w:t>
+            </w:r>
           </w:p>
         </w:tc>
         <w:tc>
@@ -1487,6 +1520,9 @@
             <w:pPr>
               <w:jc w:val="center"/>
             </w:pPr>
+            <w:r>
+              <w:t>8</w:t>
+            </w:r>
           </w:p>
         </w:tc>
         <w:tc>
@@ -1669,6 +1705,9 @@
             <w:pPr>
               <w:jc w:val="center"/>
             </w:pPr>
+            <w:r>
+              <w:t>5</w:t>
+            </w:r>
           </w:p>
         </w:tc>
         <w:tc>
@@ -1835,6 +1874,9 @@
             <w:pPr>
               <w:jc w:val="center"/>
             </w:pPr>
+            <w:r>
+              <w:t>5</w:t>
+            </w:r>
           </w:p>
         </w:tc>
         <w:tc>
@@ -2016,6 +2058,9 @@
             <w:pPr>
               <w:jc w:val="center"/>
             </w:pPr>
+            <w:r>
+              <w:t>5</w:t>
+            </w:r>
           </w:p>
         </w:tc>
         <w:tc>
@@ -2173,6 +2218,9 @@
             <w:pPr>
               <w:jc w:val="center"/>
             </w:pPr>
+            <w:r>
+              <w:t>5</w:t>
+            </w:r>
           </w:p>
         </w:tc>
         <w:tc>
@@ -2284,6 +2332,9 @@
             <w:pPr>
               <w:jc w:val="center"/>
             </w:pPr>
+            <w:r>
+              <w:t>98</w:t>
+            </w:r>
           </w:p>
         </w:tc>
         <w:tc>
@@ -2771,6 +2822,9 @@
             <w:pPr>
               <w:jc w:val="center"/>
             </w:pPr>
+            <w:r>
+              <w:t>3</w:t>
+            </w:r>
           </w:p>
         </w:tc>
       </w:tr>
@@ -2965,6 +3019,9 @@
             <w:pPr>
               <w:jc w:val="center"/>
             </w:pPr>
+            <w:r>
+              <w:t>2</w:t>
+            </w:r>
           </w:p>
         </w:tc>
       </w:tr>
@@ -3153,6 +3210,9 @@
             <w:pPr>
               <w:jc w:val="center"/>
             </w:pPr>
+            <w:r>
+              <w:t>3</w:t>
+            </w:r>
           </w:p>
         </w:tc>
       </w:tr>
@@ -3341,6 +3401,9 @@
             <w:pPr>
               <w:jc w:val="center"/>
             </w:pPr>
+            <w:r>
+              <w:t>3</w:t>
+            </w:r>
           </w:p>
         </w:tc>
       </w:tr>
@@ -3535,6 +3598,9 @@
             <w:pPr>
               <w:jc w:val="center"/>
             </w:pPr>
+            <w:r>
+              <w:t>3</w:t>
+            </w:r>
           </w:p>
         </w:tc>
       </w:tr>
@@ -3723,6 +3789,9 @@
             <w:pPr>
               <w:jc w:val="center"/>
             </w:pPr>
+            <w:r>
+              <w:t>3</w:t>
+            </w:r>
           </w:p>
         </w:tc>
       </w:tr>
@@ -3912,6 +3981,9 @@
             <w:pPr>
               <w:jc w:val="center"/>
             </w:pPr>
+            <w:r>
+              <w:t>3</w:t>
+            </w:r>
           </w:p>
         </w:tc>
       </w:tr>
@@ -4100,6 +4172,9 @@
             <w:pPr>
               <w:jc w:val="center"/>
             </w:pPr>
+            <w:r>
+              <w:t>3</w:t>
+            </w:r>
           </w:p>
         </w:tc>
       </w:tr>
@@ -4288,6 +4363,9 @@
             <w:pPr>
               <w:jc w:val="center"/>
             </w:pPr>
+            <w:r>
+              <w:t>3</w:t>
+            </w:r>
           </w:p>
         </w:tc>
       </w:tr>
@@ -4476,6 +4554,9 @@
             <w:pPr>
               <w:jc w:val="center"/>
             </w:pPr>
+            <w:r>
+              <w:t>3</w:t>
+            </w:r>
           </w:p>
         </w:tc>
       </w:tr>
@@ -4532,6 +4613,13 @@
             <w:pPr>
               <w:jc w:val="center"/>
             </w:pPr>
+            <w:r>
+              <w:rPr>
+                <w:b/>
+                <w:bCs/>
+              </w:rPr>
+              <w:t>29</w:t>
+            </w:r>
             <w:r>
               <w:rPr>
                 <w:b/>
@@ -5608,6 +5696,7 @@
   <w:style w:type="character" w:default="1" w:styleId="DefaultParagraphFont">
     <w:name w:val="Default Paragraph Font"/>
     <w:uiPriority w:val="1"/>
+    <w:semiHidden/>
     <w:unhideWhenUsed/>
   </w:style>
   <w:style w:type="table" w:default="1" w:styleId="TableNormal">

</xml_diff>